<commit_message>
fix: remove stale values from live proposal baseline
</commit_message>
<xml_diff>
--- a/backend/app/fixtures/AMEC-P-D-2026-Q-454.docx
+++ b/backend/app/fixtures/AMEC-P-D-2026-Q-454.docx
@@ -4,7 +4,7 @@
   <w:body>
     <w:p>
       <w:r>
-        <w:t xml:space="preserve">AMEC-P-D-2026-Q-498 Rev 01</w:t>
+        <w:t xml:space="preserve">AMEC-P-D-2026-Q-454 Rev 01</w:t>
       </w:r>
     </w:p>
     <w:p>
@@ -14,27 +14,27 @@
     </w:p>
     <w:p>
       <w:r>
-        <w:t xml:space="preserve">Project: The Ethiopian Orthodox Church</w:t>
+        <w:t xml:space="preserve">Project: To be confirmed by Owner</w:t>
       </w:r>
     </w:p>
     <w:p>
       <w:r>
-        <w:t xml:space="preserve">Client Name: The Ethiopian Orthodox Church</w:t>
+        <w:t xml:space="preserve">Client Name: To be confirmed by Owner</w:t>
       </w:r>
     </w:p>
     <w:p>
       <w:r>
-        <w:t xml:space="preserve">Scope: Reviewing and addressing the authorities' comments required to secure the DC2 approval for the Fire Fighting discipline</w:t>
+        <w:t xml:space="preserve">Scope: To be confirmed by Owner</w:t>
       </w:r>
     </w:p>
     <w:p>
       <w:r>
-        <w:t xml:space="preserve">Commercial value: QAR 40,000 (discounted QAR 36,000)</w:t>
+        <w:t xml:space="preserve">Commercial value: To be confirmed by Owner</w:t>
       </w:r>
     </w:p>
     <w:p>
       <w:r>
-        <w:t xml:space="preserve">Duration: 3 months</w:t>
+        <w:t xml:space="preserve">Duration: To be confirmed by Owner</w:t>
       </w:r>
     </w:p>
     <w:p>

</xml_diff>